<commit_message>
docs(solution-overview): update solution overview, architecture diagram, and md_to_docx
- Revised solution-overview.md content and regenerated Word version
- Updated architecture-diagram.drawio and added PNG export
- Improved tools/md_to_docx.py conversion script
- Added 2026-10-01 solution overview design review research

Co-Authored-By: Claude Sonnet 4.6 <noreply@anthropic.com>
</commit_message>
<xml_diff>
--- a/4. Solution/Solution Overview/solution-overview.docx
+++ b/4. Solution/Solution Overview/solution-overview.docx
@@ -153,7 +153,7 @@
           </w:tcPr>
           <w:p>
             <w:r>
-              <w:t>Placeholder</w:t>
+              <w:t>Drafted from BRD + recon facts</w:t>
             </w:r>
           </w:p>
         </w:tc>
@@ -185,7 +185,7 @@
           </w:tcPr>
           <w:p>
             <w:r>
-              <w:t>Placeholder</w:t>
+              <w:t>Drafted from recon facts, standards/framework fit still open</w:t>
             </w:r>
           </w:p>
         </w:tc>
@@ -313,7 +313,7 @@
           </w:tcPr>
           <w:p>
             <w:r>
-              <w:t>Placeholder</w:t>
+              <w:t>Drafted from recon facts, retention policy still open</w:t>
             </w:r>
           </w:p>
         </w:tc>
@@ -430,7 +430,235 @@
     </w:p>
     <w:p>
       <w:r>
-        <w:t>&gt; Placeholder. Not yet developed. Should cover: stakeholder map (training organisation, trainees, IAM/security/SIEM teams, procurement — see the Hardware BRD for the current stakeholder list), the business outcomes the framework agreement is buying (scenario coverage, availability, scalability to new sites), the value chain across the 3+5x1-year contract term, and the scope split between the hardware partner and Avanade/Alliander in business terms rather than technical layers.</w:t>
+        <w:t>Grounded in the Hardware BRD and the tender hardware recon.</w:t>
+      </w:r>
+    </w:p>
+    <w:p>
+      <w:r>
+        <w:t>Stakeholders:</w:t>
+      </w:r>
+    </w:p>
+    <w:tbl>
+      <w:tblPr>
+        <w:tblStyle w:val="LightGrid-Accent1"/>
+        <w:tblW w:type="auto" w:w="0"/>
+        <w:tblLook w:firstColumn="1" w:firstRow="1" w:lastColumn="0" w:lastRow="0" w:noHBand="0" w:noVBand="1" w:val="04A0"/>
+      </w:tblPr>
+      <w:tblGrid>
+        <w:gridCol w:w="4320"/>
+        <w:gridCol w:w="4320"/>
+      </w:tblGrid>
+      <w:tr>
+        <w:tc>
+          <w:tcPr>
+            <w:tcW w:type="dxa" w:w="4320"/>
+            <w:shd w:val="clear" w:color="auto" w:fill="2F5496"/>
+          </w:tcPr>
+          <w:p>
+            <w:r>
+              <w:rPr>
+                <w:b/>
+                <w:color w:val="FFFFFF"/>
+              </w:rPr>
+              <w:t>Stakeholder</w:t>
+            </w:r>
+          </w:p>
+        </w:tc>
+        <w:tc>
+          <w:tcPr>
+            <w:tcW w:type="dxa" w:w="4320"/>
+            <w:shd w:val="clear" w:color="auto" w:fill="2F5496"/>
+          </w:tcPr>
+          <w:p>
+            <w:r>
+              <w:rPr>
+                <w:b/>
+                <w:color w:val="FFFFFF"/>
+              </w:rPr>
+              <w:t>Role</w:t>
+            </w:r>
+          </w:p>
+        </w:tc>
+      </w:tr>
+      <w:tr>
+        <w:tc>
+          <w:tcPr>
+            <w:tcW w:type="dxa" w:w="4320"/>
+          </w:tcPr>
+          <w:p>
+            <w:r>
+              <w:t>Alliander training and learning organisation</w:t>
+            </w:r>
+          </w:p>
+        </w:tc>
+        <w:tc>
+          <w:tcPr>
+            <w:tcW w:type="dxa" w:w="4320"/>
+          </w:tcPr>
+          <w:p>
+            <w:r>
+              <w:t>Defines training scenarios and pedagogy; primary user of the instructor dashboard and learning data</w:t>
+            </w:r>
+          </w:p>
+        </w:tc>
+      </w:tr>
+      <w:tr>
+        <w:tc>
+          <w:tcPr>
+            <w:tcW w:type="dxa" w:w="4320"/>
+          </w:tcPr>
+          <w:p>
+            <w:r>
+              <w:t>Alliander trainees and monteurs</w:t>
+            </w:r>
+          </w:p>
+        </w:tc>
+        <w:tc>
+          <w:tcPr>
+            <w:tcW w:type="dxa" w:w="4320"/>
+          </w:tcPr>
+          <w:p>
+            <w:r>
+              <w:t>End users of the physical instrumentation; perform switching operations and receive fault scenarios</w:t>
+            </w:r>
+          </w:p>
+        </w:tc>
+      </w:tr>
+      <w:tr>
+        <w:tc>
+          <w:tcPr>
+            <w:tcW w:type="dxa" w:w="4320"/>
+          </w:tcPr>
+          <w:p>
+            <w:r>
+              <w:t>Alliander IAM, security, and SIEM teams</w:t>
+            </w:r>
+          </w:p>
+        </w:tc>
+        <w:tc>
+          <w:tcPr>
+            <w:tcW w:type="dxa" w:w="4320"/>
+          </w:tcPr>
+          <w:p>
+            <w:r>
+              <w:t>Own the identity platform the solution must integrate with; consume authentication event exports</w:t>
+            </w:r>
+          </w:p>
+        </w:tc>
+      </w:tr>
+      <w:tr>
+        <w:tc>
+          <w:tcPr>
+            <w:tcW w:type="dxa" w:w="4320"/>
+          </w:tcPr>
+          <w:p>
+            <w:r>
+              <w:t>Alliander procurement and contract management</w:t>
+            </w:r>
+          </w:p>
+        </w:tc>
+        <w:tc>
+          <w:tcPr>
+            <w:tcW w:type="dxa" w:w="4320"/>
+          </w:tcPr>
+          <w:p>
+            <w:r>
+              <w:t>Own the framework agreement, SLA, and the 8-year contract term across up to 5 one-year extensions</w:t>
+            </w:r>
+          </w:p>
+        </w:tc>
+      </w:tr>
+      <w:tr>
+        <w:tc>
+          <w:tcPr>
+            <w:tcW w:type="dxa" w:w="4320"/>
+          </w:tcPr>
+          <w:p>
+            <w:r>
+              <w:t>Avanade bid and delivery team</w:t>
+            </w:r>
+          </w:p>
+        </w:tc>
+        <w:tc>
+          <w:tcPr>
+            <w:tcW w:type="dxa" w:w="4320"/>
+          </w:tcPr>
+          <w:p>
+            <w:r>
+              <w:t>Designs layers 4-6, authors the proposal, integrates the hardware partner's deliverables</w:t>
+            </w:r>
+          </w:p>
+        </w:tc>
+      </w:tr>
+      <w:tr>
+        <w:tc>
+          <w:tcPr>
+            <w:tcW w:type="dxa" w:w="4320"/>
+          </w:tcPr>
+          <w:p>
+            <w:r>
+              <w:t>IoT hardware partner</w:t>
+            </w:r>
+          </w:p>
+        </w:tc>
+        <w:tc>
+          <w:tcPr>
+            <w:tcW w:type="dxa" w:w="4320"/>
+          </w:tcPr>
+          <w:p>
+            <w:r>
+              <w:t>Sources, builds, enables, services, and supports layers 1-3</w:t>
+            </w:r>
+          </w:p>
+        </w:tc>
+      </w:tr>
+    </w:tbl>
+    <w:p/>
+    <w:p>
+      <w:r>
+        <w:t>Business outcomes the framework agreement is buying:</w:t>
+      </w:r>
+    </w:p>
+    <w:p>
+      <w:pPr>
+        <w:pStyle w:val="ListBullet"/>
+      </w:pPr>
+      <w:r>
+        <w:t>Digital coverage of all 31 Bijlage T core training scenarios (10 OV, 11 MK, 5 LS, 5 MS), replacing instructor-only manual observation (Bijlage L ACC-03).</w:t>
+      </w:r>
+    </w:p>
+    <w:p>
+      <w:pPr>
+        <w:pStyle w:val="ListBullet"/>
+      </w:pPr>
+      <w:r>
+        <w:t>Objective, data-backed scoring of trainee sessions instead of subjective instructor judgement, feeding the GC3 learning-data ambition.</w:t>
+      </w:r>
+    </w:p>
+    <w:p>
+      <w:pPr>
+        <w:pStyle w:val="ListBullet"/>
+      </w:pPr>
+      <w:r>
+        <w:t>Training availability of at least 99% during training hours, with fallback scenarios proven at acceptance (Bijlage L PERF-03, PERF-04; Bijlage Q SLA).</w:t>
+      </w:r>
+    </w:p>
+    <w:p>
+      <w:pPr>
+        <w:pStyle w:val="ListBullet"/>
+      </w:pPr>
+      <w:r>
+        <w:t>Scalability: the same architecture absorbing additional training environments added under the framework, without redesign (Aanbestedingsleidraad §1.3; Bijlage N GC2).</w:t>
+      </w:r>
+    </w:p>
+    <w:p>
+      <w:r>
+        <w:t>Value chain across the 8-year term: a 3-year base contract plus up to 5 one-year extensions (max. 8 years total). Implementation starts with a pilot/PoC on one representative training environment before broader rollout (Bijlage L IMP-03), then scales across the initial 4 environments (1 schakellokaal + 1 meetveld each in Haarlem and Zevenaar) and any further environments added later in the term.</w:t>
+      </w:r>
+    </w:p>
+    <w:p>
+      <w:r>
+        <w:t>Scope boundary in business/commercial terms (Bijlage J pricing structure): hardware delivery ("Levering van Hardware") and hardware installation ("Aansluiten van hardwarecomponenten") are one-time, separately priced line items owned by the hardware partner. Ongoing hardware upkeep is folded into the annual "Technisch beheer en support" line, not billed as a separate hardware maintenance item. Avanade's software development, base licence, and functional/technical support line items cover layers 4-6. All pricing is all-in; no line items may be added after the questions deadline.</w:t>
       </w:r>
     </w:p>
     <w:p>
@@ -443,7 +671,46 @@
     </w:p>
     <w:p>
       <w:r>
-        <w:t>&gt; Placeholder. Not yet developed. Should cover: how the solution fits alongside Alliander's existing systems, Archipel (being replaced under a separate tender) and LVS (the existing learning management system, future integration required per GC3), capability mapping against Alliander's broader IT/OT portfolio, and how this solution avoids creating a parallel, disconnected system.</w:t>
+        <w:t>Grounded in the tender hardware recon §2-3.</w:t>
+      </w:r>
+    </w:p>
+    <w:p>
+      <w:r>
+        <w:t>Existing Alliander systems this solution must coexist with:</w:t>
+      </w:r>
+    </w:p>
+    <w:p>
+      <w:pPr>
+        <w:pStyle w:val="ListBullet"/>
+      </w:pPr>
+      <w:r>
+        <w:t>Archipel — an existing system being replaced under a separate tender, out of scope here. The new platform must not depend on Archipel and must be able to operate independently of whatever replaces it (Aanbestedingsleidraad §1.5, interpreted).</w:t>
+      </w:r>
+    </w:p>
+    <w:p>
+      <w:pPr>
+        <w:pStyle w:val="ListBullet"/>
+      </w:pPr>
+      <w:r>
+        <w:t>LVS (Leer Volg Systeem) — Alliander's existing learning management system. Not an integration requirement today, but the platform must expose open APIs so future LVS integration is possible; LVS API-readiness is itself a GC3 quality-scoring dimension.</w:t>
+      </w:r>
+    </w:p>
+    <w:p>
+      <w:pPr>
+        <w:pStyle w:val="ListBullet"/>
+      </w:pPr>
+      <w:r>
+        <w:t>Alliander IAM — the one true integration knock-out (see Security Architecture). Every identity touchpoint in the solution, including edge hardware, routes through it.</w:t>
+      </w:r>
+    </w:p>
+    <w:p>
+      <w:r>
+        <w:t>Operating-model constraint (Bijlage L Voorblad, explicit statement): Alliander is explicit that it does *not* want a generic enterprise simulation platform. It wants a pragmatic, manageable digital control layer, and trainers must be able to manage scenarios independently, without structural dependency on the supplier's development capacity after go-live. This shapes the enterprise fit: the solution should minimize ongoing custom-development dependency and favor configurable scenario management over code-level changes.</w:t>
+      </w:r>
+    </w:p>
+    <w:p>
+      <w:r>
+        <w:t>Portfolio/capability mapping against Alliander's broader IT/OT estate: not specified anywhere in the tender documents read to date. No enterprise architecture framework (for example TOGAF, ArchiMate), reference architecture, or IT/OT segmentation standard is named by Alliander. This is a genuine open question rather than something inferable from available sources — worth raising if a further clarification round (NvI 2) opens.</w:t>
       </w:r>
     </w:p>
     <w:p>
@@ -456,83 +723,65 @@
     </w:p>
     <w:p>
       <w:r>
-        <w:t>The diagram below is also available as an editable draw.io file: architecture-diagram.drawio. Open it in the draw.io desktop app, diagrams.net, or the VS Code draw.io extension.</w:t>
+        <w:t>The diagram below is rendered from the editable draw.io source: architecture-diagram.drawio. Open it in the draw.io desktop app, diagrams.net, or the VS Code draw.io extension to edit it, then export as PNG over architecture-diagram.png to refresh the image below.</w:t>
       </w:r>
     </w:p>
     <w:p>
       <w:r>
-        <w:rPr>
-          <w:rFonts w:ascii="Consolas" w:hAnsi="Consolas"/>
-          <w:sz w:val="16"/>
-        </w:rPr>
-        <w:t>+===========================================+     +===========================================+</w:t>
-        <w:br/>
-        <w:t>|  PS: Partner Scope                        |     |  AS: Avanade / Alliander Scope             |</w:t>
-        <w:br/>
-        <w:t>|  Hardware Layer (offline-capable)         |     |  Digital Layer                             |</w:t>
-        <w:br/>
-        <w:t>|                                            |     |                                             |</w:t>
-        <w:br/>
-        <w:t>|  +--------------------------------------+ |     |  +--------------------------------------+   |</w:t>
-        <w:br/>
-        <w:t>|  | Layer 1 - Physical                  | |     |  | Layer 4 - Digital Twin               |   |</w:t>
-        <w:br/>
-        <w:t>|  | MV/LV switchgear, RMUs, breakers,   | |     |  | Authoritative network model,         |   |</w:t>
-        <w:br/>
-        <w:t>|  | meterkast, street lighting (FlexOV) | |     |  | live state, session history          |   |</w:t>
-        <w:br/>
-        <w:t>|  +------------------+-------------------+ |     |  +------------------+-------------------+   |</w:t>
-        <w:br/>
-        <w:t>|                     v                     |     |                     v                       |</w:t>
-        <w:br/>
-        <w:t>|  +--------------------------------------+ |     |  +--------------------------------------+   |</w:t>
-        <w:br/>
-        <w:t>|  | Layer 2 - Instrument                | |     |  | Layer 5 - AI &amp; Agentic                |   |</w:t>
-        <w:br/>
-        <w:t>|  | Sensors, relays, I/O modules,       | |     |  | Vision step validation, procedure    |   |</w:t>
-        <w:br/>
-        <w:t>|  | RFID/NFC, fault-injection points    | |     |  | copilot, fault engine, scoring       |   |</w:t>
-        <w:br/>
-        <w:t>|  +------------------+-------------------+ |     |  +------------------+-------------------+   |</w:t>
-        <w:br/>
-        <w:t>|                     v                     |     |                     v                       |</w:t>
-        <w:br/>
-        <w:t>|  +--------------------------------------+ |     |  +--------------------------------------+   |</w:t>
-        <w:br/>
-        <w:t>|  | Layer 3 - Connect (Edge)            |-|-----|-&gt;| Layer 6 - Experience                  |   |</w:t>
-        <w:br/>
-        <w:t>|  | On-site gateway + edge server       | | sync when connectivity available, async,    |   |</w:t>
-        <w:br/>
-        <w:t>|  | industrial protocol stack, UPS      | | not required for operation                  |   |</w:t>
-        <w:br/>
-        <w:t>|  | runs FULLY OFFLINE                  | |     |  | Instructor dashboard, trainee HMI,   |   |</w:t>
-        <w:br/>
-        <w:t>|  +--------------------------------------+ |     |  | optional AR/MR, voice                |   |</w:t>
-        <w:br/>
-        <w:t>|                                            |     |  +--------------------------------------+   |</w:t>
-        <w:br/>
-        <w:t>+===========================================+     +===========================================+</w:t>
-        <w:br/>
-        <w:t xml:space="preserve">        ^                                                    ^</w:t>
-        <w:br/>
-        <w:t xml:space="preserve">        | OIDC/OAuth2 + PKCE,                                | never overridden by</w:t>
-        <w:br/>
-        <w:t xml:space="preserve">        | SIEM export, no local                              |</w:t>
-        <w:br/>
-        <w:t xml:space="preserve">        | credential stores                                  |</w:t>
-        <w:br/>
-        <w:t xml:space="preserve">  +--------------------------+                    +--------------------------------+</w:t>
-        <w:br/>
-        <w:t xml:space="preserve">  | Alliander IAM            |                    | Physical safety systems         |</w:t>
-        <w:br/>
-        <w:t xml:space="preserve">  +--------------------------+                    | interlocks, e-stop, LOTO         |</w:t>
-        <w:br/>
-        <w:t xml:space="preserve">                                                    | INDEPENDENT of digital layer    |</w:t>
-        <w:br/>
-        <w:t xml:space="preserve">                                                    +--------------------------------+</w:t>
+        <w:t>&gt; Image is stale. architecture-diagram.png was exported before the latest diagram fixes (the Layer 3 → Layer 6 live-view connection, and the hedged protocol/trainee-ID labels) and was exported with a dark background instead of the intended light-grey scope containers. Re-export from the current .drawio file before this goes into a submission.</w:t>
       </w:r>
     </w:p>
-    <w:p/>
+    <w:p>
+      <w:pPr>
+        <w:jc w:val="center"/>
+      </w:pPr>
+      <w:r>
+        <w:drawing>
+          <wp:inline xmlns:a="http://schemas.openxmlformats.org/drawingml/2006/main" xmlns:pic="http://schemas.openxmlformats.org/drawingml/2006/picture">
+            <wp:extent cx="5760000" cy="5914286"/>
+            <wp:docPr id="1" name="Picture 1"/>
+            <wp:cNvGraphicFramePr>
+              <a:graphicFrameLocks noChangeAspect="1"/>
+            </wp:cNvGraphicFramePr>
+            <a:graphic>
+              <a:graphicData uri="http://schemas.openxmlformats.org/drawingml/2006/picture">
+                <pic:pic>
+                  <pic:nvPicPr>
+                    <pic:cNvPr id="0" name="architecture-diagram.png"/>
+                    <pic:cNvPicPr/>
+                  </pic:nvPicPr>
+                  <pic:blipFill>
+                    <a:blip r:embed="rId9"/>
+                    <a:stretch>
+                      <a:fillRect/>
+                    </a:stretch>
+                  </pic:blipFill>
+                  <pic:spPr>
+                    <a:xfrm>
+                      <a:off x="0" y="0"/>
+                      <a:ext cx="5760000" cy="5914286"/>
+                    </a:xfrm>
+                    <a:prstGeom prst="rect"/>
+                  </pic:spPr>
+                </pic:pic>
+              </a:graphicData>
+            </a:graphic>
+          </wp:inline>
+        </w:drawing>
+      </w:r>
+    </w:p>
+    <w:p>
+      <w:pPr>
+        <w:jc w:val="center"/>
+      </w:pPr>
+      <w:r>
+        <w:rPr>
+          <w:i/>
+          <w:sz w:val="18"/>
+        </w:rPr>
+        <w:t>Digital Schakellokalen solution architecture diagram: Partner Scope (Layers 1-3, hardware, offline-capable) on the left and Avanade/Alliander Scope (Layers 4-6, digital, cloud-hosted EEA) on the right, with Alliander IAM and physical safety systems shown as cross-cutting concerns below each column.</w:t>
+      </w:r>
+    </w:p>
     <w:p>
       <w:pPr>
         <w:pStyle w:val="Heading2"/>
@@ -602,7 +851,15 @@
         <w:pStyle w:val="ListBullet"/>
       </w:pPr>
       <w:r>
-        <w:t>The edge-to-cloud sync is asynchronous and best-effort; a training session never blocks on cloud reachability.</w:t>
+        <w:t>Layer 3 connects to Layer 6 directly over the local network for live instructor/trainee observation during a session; this connection does not depend on cloud reachability.</w:t>
+      </w:r>
+    </w:p>
+    <w:p>
+      <w:pPr>
+        <w:pStyle w:val="ListBullet"/>
+      </w:pPr>
+      <w:r>
+        <w:t>The edge-to-cloud sync (Layer 3 to Layer 4) is a separate, asynchronous, best-effort path; a training session never blocks on cloud reachability.</w:t>
       </w:r>
     </w:p>
     <w:p>
@@ -804,7 +1061,37 @@
     </w:p>
     <w:p>
       <w:r>
-        <w:t>&gt; Placeholder. Not yet developed. Should cover: the digital twin's data model (network topology, live state, scenario/fault state, session history — ITAR-06), the learning-data model captured for GC3 (trainee actions, outcomes, session dossiers), data flow between edge and cloud (what syncs, how often, conflict handling), retention policy, and the EEA-only storage boundary (Bijlage L IT-03, LCD11) including the required inventory of datacentres/cloud regions and their role (production/test/backup).</w:t>
+        <w:t>Grounded in Bijlage L (ITAR-06, IT-03, IT-04, LCD11) and Bijlage N GC3.</w:t>
+      </w:r>
+    </w:p>
+    <w:p>
+      <w:r>
+        <w:t>Digital twin data model: a central, authoritative digital network model representing both the physical and logical network — topology, live component state, active scenario/fault state, and session history (Bijlage L ITAR-06). This model is the basis for scenario analysis, simulation, validation, and learning-data extraction, and it is the same Layer 4 store referenced in the Solution Architecture.</w:t>
+      </w:r>
+    </w:p>
+    <w:p>
+      <w:r>
+        <w:t>Learning-data model (GC3): trainee actions and outcomes captured per session — which scenario ran, what faults were injected, how the trainee responded, and the resulting score — structured as a session dossier. This is the dataset GC3 scores the solution against, and it is also the dataset that would eventually flow into LVS if that integration is built.</w:t>
+      </w:r>
+    </w:p>
+    <w:p>
+      <w:r>
+        <w:t>Edge-to-cloud data flow: consistent with the Network Architecture design, session and scenario data is captured locally at the edge first (so a session never depends on cloud reachability), then synced asynchronously to the cloud-hosted digital twin and learning-data store when connectivity is available. Conflict handling and exact sync cadence are not yet designed.</w:t>
+      </w:r>
+    </w:p>
+    <w:p>
+      <w:r>
+        <w:t>EEA-only residency (knock-out): all data is stored exclusively within the EEA — stated twice independently in Bijlage L (IT-03, and again under cloud-provider requirements as LCD11). The supplier must supply a complete, current inventory of every datacentre, cloud region, and storage service used, including physical country and role (production, test, backup, archival, failover); any change to storage locations must be reported to Alliander in advance for re-assessment.</w:t>
+      </w:r>
+    </w:p>
+    <w:p>
+      <w:r>
+        <w:t>Encryption: data traffic is encrypted in transit at TLS 1.2 minimum, TLS 1.3 preferred (Bijlage L IT-04). Encryption at rest is not explicitly mandated in the tender documents read to date; treat industry-standard at-rest encryption (for example AES-256) as an Avanade design default pending confirmation, not a quoted tender requirement.</w:t>
+      </w:r>
+    </w:p>
+    <w:p>
+      <w:r>
+        <w:t>Open items: retention period (how long session/learning data is kept, and any Alliander-driven deletion requirement) is not specified anywhere in the tender documents and needs a decision before this section can be called complete.</w:t>
       </w:r>
     </w:p>
     <w:p>
@@ -1014,7 +1301,7 @@
         <w:pStyle w:val="ListBullet"/>
       </w:pPr>
       <w:r>
-        <w:t>Fill in the Business, Enterprise, and Data architecture placeholders above; none of them exist yet, and GC1/GC2 scoring depends on a credible, complete architecture package, not just the solution diagram.</w:t>
+        <w:t>Blocked on external input — confirm the Network architecture's protocol assumptions (OPC-UA/Modbus/MQTT) with the hardware partner and the Zevenaar/Haarlem site survey before stating them as fact in a submission. This cannot be resolved from the tender documents alone; it needs a conversation with the partner.</w:t>
       </w:r>
     </w:p>
     <w:p>
@@ -1022,7 +1309,15 @@
         <w:pStyle w:val="ListBullet"/>
       </w:pPr>
       <w:r>
-        <w:t>Confirm the Network architecture's protocol assumptions (OPC-UA/Modbus/MQTT) with the hardware partner and the Zevenaar/Haarlem site survey before stating them as fact in a submission.</w:t>
+        <w:t>Decide the data retention policy (how long session/learning data is kept) — not specified in the tender documents; needs an Alliander- or Avanade-side decision.</w:t>
+      </w:r>
+    </w:p>
+    <w:p>
+      <w:pPr>
+        <w:pStyle w:val="ListBullet"/>
+      </w:pPr>
+      <w:r>
+        <w:t>Confirm whether Alliander has an enterprise architecture framework or IT/OT segmentation standard the solution should align to; not stated anywhere in the tender documents — a good candidate for an NvI 2 clarification question if another round opens.</w:t>
       </w:r>
     </w:p>
     <w:p>
@@ -1039,6 +1334,14 @@
       </w:pPr>
       <w:r>
         <w:t>Cross-check against the final RFP text once NvI 2 (if issued) closes any open questions.</w:t>
+      </w:r>
+    </w:p>
+    <w:p>
+      <w:pPr>
+        <w:pStyle w:val="ListBullet"/>
+      </w:pPr>
+      <w:r>
+        <w:t>Get a solution-architecture review of this document before it goes to Kryptonite-style red-team review.</w:t>
       </w:r>
     </w:p>
     <w:p>

</xml_diff>